<commit_message>
A company or trust as owner or Manager signs through a person: the questionnaire asks who signs and their title, and every signature block, exhibit adoption, amendment, and series consent prints the entity's name, By: over the rule, and the printed name and title beneath, flush with the rule. Format gate: headings compared as a count, since a grown master dilutes the share without losing a heading
Co-Authored-By: Claude Fable 5.1 <noreply@anthropic.com>
</commit_message>
<xml_diff>
--- a/docs/word/FPSLLC Amendment to Operating Agreement - FORM.docx
+++ b/docs/word/FPSLLC Amendment to Operating Agreement - FORM.docx
@@ -430,6 +430,83 @@
     </w:p>
     <w:p>
       <w:pPr>
+        <w:widowControl/>
+        <w:spacing w:after="160"/>
+        <w:jc w:val="both"/>
+      </w:pPr>
+      <w:r>
+        <w:rPr>
+          <w:rFonts w:ascii="Times New Roman" w:hAnsi="Times New Roman"/>
+          <w:sz w:val="24"/>
+          <w:szCs w:val="24"/>
+        </w:rPr>
+        <w:t xml:space="preserve">[SIGNATORY NAME]</w:t>
+      </w:r>
+    </w:p>
+    <w:p>
+      <w:pPr>
+        <w:keepNext/>
+        <w:widowControl/>
+        <w:spacing w:after="160"/>
+        <w:jc w:val="both"/>
+      </w:pPr>
+      <w:r>
+        <w:rPr>
+          <w:rFonts w:ascii="Times New Roman" w:hAnsi="Times New Roman"/>
+          <w:sz w:val="24"/>
+          <w:szCs w:val="24"/>
+        </w:rPr>
+        <w:t xml:space="preserve">By: _____________________________</w:t>
+      </w:r>
+    </w:p>
+    <w:p>
+      <w:pPr>
+        <w:widowControl/>
+        <w:spacing w:after="160"/>
+        <w:jc w:val="both"/>
+      </w:pPr>
+      <w:r>
+        <w:rPr>
+          <w:rFonts w:ascii="Times New Roman" w:hAnsi="Times New Roman"/>
+          <w:sz w:val="24"/>
+          <w:szCs w:val="24"/>
+        </w:rPr>
+        <w:t xml:space="preserve">[[indent]][PRINTED NAME]</w:t>
+      </w:r>
+    </w:p>
+    <w:p>
+      <w:pPr>
+        <w:widowControl/>
+        <w:spacing w:after="160"/>
+        <w:jc w:val="both"/>
+      </w:pPr>
+      <w:r>
+        <w:rPr>
+          <w:rFonts w:ascii="Times New Roman" w:hAnsi="Times New Roman"/>
+          <w:sz w:val="24"/>
+          <w:szCs w:val="24"/>
+        </w:rPr>
+        <w:t xml:space="preserve">[[indent]][TITLE]</w:t>
+      </w:r>
+    </w:p>
+    <w:p>
+      <w:pPr>
+        <w:keepNext/>
+        <w:widowControl/>
+        <w:spacing w:after="160"/>
+        <w:jc w:val="both"/>
+      </w:pPr>
+      <w:r>
+        <w:rPr>
+          <w:rFonts w:ascii="Times New Roman" w:hAnsi="Times New Roman"/>
+          <w:sz w:val="24"/>
+          <w:szCs w:val="24"/>
+        </w:rPr>
+        <w:t xml:space="preserve">Date: _____________________________</w:t>
+      </w:r>
+    </w:p>
+    <w:p>
+      <w:pPr>
         <w:keepNext/>
         <w:widowControl/>
         <w:spacing w:after="160"/>
@@ -482,6 +559,83 @@
           <w:szCs w:val="24"/>
         </w:rPr>
         <w:t xml:space="preserve">[MANAGER NAME], Manager</w:t>
+      </w:r>
+    </w:p>
+    <w:p>
+      <w:pPr>
+        <w:keepNext/>
+        <w:widowControl/>
+        <w:spacing w:after="160"/>
+        <w:jc w:val="both"/>
+      </w:pPr>
+      <w:r>
+        <w:rPr>
+          <w:rFonts w:ascii="Times New Roman" w:hAnsi="Times New Roman"/>
+          <w:sz w:val="24"/>
+          <w:szCs w:val="24"/>
+        </w:rPr>
+        <w:t xml:space="preserve">Date: _____________________________</w:t>
+      </w:r>
+    </w:p>
+    <w:p>
+      <w:pPr>
+        <w:widowControl/>
+        <w:spacing w:after="160"/>
+        <w:jc w:val="both"/>
+      </w:pPr>
+      <w:r>
+        <w:rPr>
+          <w:rFonts w:ascii="Times New Roman" w:hAnsi="Times New Roman"/>
+          <w:sz w:val="24"/>
+          <w:szCs w:val="24"/>
+        </w:rPr>
+        <w:t xml:space="preserve">[MANAGER NAME], Manager</w:t>
+      </w:r>
+    </w:p>
+    <w:p>
+      <w:pPr>
+        <w:keepNext/>
+        <w:widowControl/>
+        <w:spacing w:after="160"/>
+        <w:jc w:val="both"/>
+      </w:pPr>
+      <w:r>
+        <w:rPr>
+          <w:rFonts w:ascii="Times New Roman" w:hAnsi="Times New Roman"/>
+          <w:sz w:val="24"/>
+          <w:szCs w:val="24"/>
+        </w:rPr>
+        <w:t xml:space="preserve">By: _____________________________</w:t>
+      </w:r>
+    </w:p>
+    <w:p>
+      <w:pPr>
+        <w:widowControl/>
+        <w:spacing w:after="160"/>
+        <w:jc w:val="both"/>
+      </w:pPr>
+      <w:r>
+        <w:rPr>
+          <w:rFonts w:ascii="Times New Roman" w:hAnsi="Times New Roman"/>
+          <w:sz w:val="24"/>
+          <w:szCs w:val="24"/>
+        </w:rPr>
+        <w:t xml:space="preserve">[[indent]][PRINTED NAME]</w:t>
+      </w:r>
+    </w:p>
+    <w:p>
+      <w:pPr>
+        <w:widowControl/>
+        <w:spacing w:after="160"/>
+        <w:jc w:val="both"/>
+      </w:pPr>
+      <w:r>
+        <w:rPr>
+          <w:rFonts w:ascii="Times New Roman" w:hAnsi="Times New Roman"/>
+          <w:sz w:val="24"/>
+          <w:szCs w:val="24"/>
+        </w:rPr>
+        <w:t xml:space="preserve">[[indent]][TITLE]</w:t>
       </w:r>
     </w:p>
     <w:p>

</xml_diff>

<commit_message>
Fix Batch 25 document tables, literal client text, and signature pagination
</commit_message>
<xml_diff>
--- a/docs/word/FPSLLC Amendment to Operating Agreement - FORM.docx
+++ b/docs/word/FPSLLC Amendment to Operating Agreement - FORM.docx
@@ -461,32 +461,34 @@
     </w:p>
     <w:p>
       <w:pPr>
-        <w:widowControl/>
-        <w:spacing w:after="160"/>
-        <w:jc w:val="both"/>
-      </w:pPr>
-      <w:r>
-        <w:rPr>
-          <w:rFonts w:ascii="Times New Roman" w:hAnsi="Times New Roman"/>
-          <w:sz w:val="24"/>
-          <w:szCs w:val="24"/>
-        </w:rPr>
-        <w:t xml:space="preserve">[[indent]][PRINTED NAME]</w:t>
-      </w:r>
-    </w:p>
-    <w:p>
-      <w:pPr>
-        <w:widowControl/>
-        <w:spacing w:after="160"/>
-        <w:jc w:val="both"/>
-      </w:pPr>
-      <w:r>
-        <w:rPr>
-          <w:rFonts w:ascii="Times New Roman" w:hAnsi="Times New Roman"/>
-          <w:sz w:val="24"/>
-          <w:szCs w:val="24"/>
-        </w:rPr>
-        <w:t xml:space="preserve">[[indent]][TITLE]</w:t>
+        <w:keepLines/>
+        <w:widowControl/>
+        <w:spacing w:after="160"/>
+        <w:ind w:left="407"/>
+      </w:pPr>
+      <w:r>
+        <w:rPr>
+          <w:rFonts w:ascii="Times New Roman" w:hAnsi="Times New Roman"/>
+          <w:sz w:val="24"/>
+          <w:szCs w:val="24"/>
+        </w:rPr>
+        <w:t xml:space="preserve">[PRINTED NAME]</w:t>
+      </w:r>
+    </w:p>
+    <w:p>
+      <w:pPr>
+        <w:keepLines/>
+        <w:widowControl/>
+        <w:spacing w:after="160"/>
+        <w:ind w:left="407"/>
+      </w:pPr>
+      <w:r>
+        <w:rPr>
+          <w:rFonts w:ascii="Times New Roman" w:hAnsi="Times New Roman"/>
+          <w:sz w:val="24"/>
+          <w:szCs w:val="24"/>
+        </w:rPr>
+        <w:t xml:space="preserve">[TITLE]</w:t>
       </w:r>
     </w:p>
     <w:p>
@@ -610,32 +612,34 @@
     </w:p>
     <w:p>
       <w:pPr>
-        <w:widowControl/>
-        <w:spacing w:after="160"/>
-        <w:jc w:val="both"/>
-      </w:pPr>
-      <w:r>
-        <w:rPr>
-          <w:rFonts w:ascii="Times New Roman" w:hAnsi="Times New Roman"/>
-          <w:sz w:val="24"/>
-          <w:szCs w:val="24"/>
-        </w:rPr>
-        <w:t xml:space="preserve">[[indent]][PRINTED NAME]</w:t>
-      </w:r>
-    </w:p>
-    <w:p>
-      <w:pPr>
-        <w:widowControl/>
-        <w:spacing w:after="160"/>
-        <w:jc w:val="both"/>
-      </w:pPr>
-      <w:r>
-        <w:rPr>
-          <w:rFonts w:ascii="Times New Roman" w:hAnsi="Times New Roman"/>
-          <w:sz w:val="24"/>
-          <w:szCs w:val="24"/>
-        </w:rPr>
-        <w:t xml:space="preserve">[[indent]][TITLE]</w:t>
+        <w:keepLines/>
+        <w:widowControl/>
+        <w:spacing w:after="160"/>
+        <w:ind w:left="407"/>
+      </w:pPr>
+      <w:r>
+        <w:rPr>
+          <w:rFonts w:ascii="Times New Roman" w:hAnsi="Times New Roman"/>
+          <w:sz w:val="24"/>
+          <w:szCs w:val="24"/>
+        </w:rPr>
+        <w:t xml:space="preserve">[PRINTED NAME]</w:t>
+      </w:r>
+    </w:p>
+    <w:p>
+      <w:pPr>
+        <w:keepLines/>
+        <w:widowControl/>
+        <w:spacing w:after="160"/>
+        <w:ind w:left="407"/>
+      </w:pPr>
+      <w:r>
+        <w:rPr>
+          <w:rFonts w:ascii="Times New Roman" w:hAnsi="Times New Roman"/>
+          <w:sz w:val="24"/>
+          <w:szCs w:val="24"/>
+        </w:rPr>
+        <w:t xml:space="preserve">[TITLE]</w:t>
       </w:r>
     </w:p>
     <w:p>

</xml_diff>

<commit_message>
Fix Batch 32 drafting choices and client document output
</commit_message>
<xml_diff>
--- a/docs/word/FPSLLC Amendment to Operating Agreement - FORM.docx
+++ b/docs/word/FPSLLC Amendment to Operating Agreement - FORM.docx
@@ -116,7 +116,179 @@
           <w:sz w:val="24"/>
           <w:szCs w:val="24"/>
         </w:rPr>
-        <w:t xml:space="preserve">, a Florida protected series limited liability company (the "Company"), is made effective as of [AMENDMENT DATE], by the undersigned sole member (the "Member")the undersigned members (each a "Member" and collectively the "Members"), and is acknowledged by the undersigned ManagerManagers.</w:t>
+        <w:t xml:space="preserve">, a Florida protected series limited liability company (the "Company"), is made effective as of [AMENDMENT DATE], by  </w:t>
+      </w:r>
+      <w:r>
+        <w:rPr>
+          <w:rStyle w:val="DraftingChoice"/>
+          <w:rFonts w:ascii="Times New Roman" w:hAnsi="Times New Roman"/>
+          <w:i/>
+          <w:sz w:val="24"/>
+          <w:szCs w:val="24"/>
+        </w:rPr>
+        <w:t xml:space="preserve">[One member: </w:t>
+      </w:r>
+      <w:r>
+        <w:rPr>
+          <w:rFonts w:ascii="Times New Roman" w:hAnsi="Times New Roman"/>
+          <w:sz w:val="24"/>
+          <w:szCs w:val="24"/>
+        </w:rPr>
+        <w:t xml:space="preserve">the undersigned sole member (the "Member")</w:t>
+      </w:r>
+      <w:r>
+        <w:rPr>
+          <w:rStyle w:val="DraftingChoice"/>
+          <w:rFonts w:ascii="Times New Roman" w:hAnsi="Times New Roman"/>
+          <w:i/>
+          <w:sz w:val="24"/>
+          <w:szCs w:val="24"/>
+        </w:rPr>
+        <w:t xml:space="preserve">]</w:t>
+      </w:r>
+      <w:r>
+        <w:rPr>
+          <w:rFonts w:ascii="Times New Roman" w:hAnsi="Times New Roman"/>
+          <w:sz w:val="24"/>
+          <w:szCs w:val="24"/>
+        </w:rPr>
+        <w:t xml:space="preserve">  </w:t>
+      </w:r>
+      <w:r>
+        <w:rPr>
+          <w:rStyle w:val="DraftingChoice"/>
+          <w:rFonts w:ascii="Times New Roman" w:hAnsi="Times New Roman"/>
+          <w:i/>
+          <w:sz w:val="24"/>
+          <w:szCs w:val="24"/>
+        </w:rPr>
+        <w:t xml:space="preserve">[Multiple members: </w:t>
+      </w:r>
+      <w:r>
+        <w:rPr>
+          <w:rFonts w:ascii="Times New Roman" w:hAnsi="Times New Roman"/>
+          <w:sz w:val="24"/>
+          <w:szCs w:val="24"/>
+        </w:rPr>
+        <w:t xml:space="preserve">the undersigned members (each a "Member" and collectively the "Members")</w:t>
+      </w:r>
+      <w:r>
+        <w:rPr>
+          <w:rStyle w:val="DraftingChoice"/>
+          <w:rFonts w:ascii="Times New Roman" w:hAnsi="Times New Roman"/>
+          <w:i/>
+          <w:sz w:val="24"/>
+          <w:szCs w:val="24"/>
+        </w:rPr>
+        <w:t xml:space="preserve">]</w:t>
+      </w:r>
+      <w:r>
+        <w:rPr>
+          <w:rFonts w:ascii="Times New Roman" w:hAnsi="Times New Roman"/>
+          <w:sz w:val="24"/>
+          <w:szCs w:val="24"/>
+        </w:rPr>
+        <w:t xml:space="preserve">  </w:t>
+      </w:r>
+      <w:r>
+        <w:rPr>
+          <w:rStyle w:val="DraftingChoice"/>
+          <w:rFonts w:ascii="Times New Roman" w:hAnsi="Times New Roman"/>
+          <w:i/>
+          <w:sz w:val="24"/>
+          <w:szCs w:val="24"/>
+        </w:rPr>
+        <w:t xml:space="preserve">[If manager-managed company: </w:t>
+      </w:r>
+      <w:r>
+        <w:rPr>
+          <w:rFonts w:ascii="Times New Roman" w:hAnsi="Times New Roman"/>
+          <w:sz w:val="24"/>
+          <w:szCs w:val="24"/>
+        </w:rPr>
+        <w:t xml:space="preserve">, and is acknowledged by the undersigned  </w:t>
+      </w:r>
+      <w:r>
+        <w:rPr>
+          <w:rStyle w:val="DraftingChoice"/>
+          <w:rFonts w:ascii="Times New Roman" w:hAnsi="Times New Roman"/>
+          <w:i/>
+          <w:sz w:val="24"/>
+          <w:szCs w:val="24"/>
+        </w:rPr>
+        <w:t xml:space="preserve">[One manager: </w:t>
+      </w:r>
+      <w:r>
+        <w:rPr>
+          <w:rFonts w:ascii="Times New Roman" w:hAnsi="Times New Roman"/>
+          <w:sz w:val="24"/>
+          <w:szCs w:val="24"/>
+        </w:rPr>
+        <w:t xml:space="preserve">Manager</w:t>
+      </w:r>
+      <w:r>
+        <w:rPr>
+          <w:rStyle w:val="DraftingChoice"/>
+          <w:rFonts w:ascii="Times New Roman" w:hAnsi="Times New Roman"/>
+          <w:i/>
+          <w:sz w:val="24"/>
+          <w:szCs w:val="24"/>
+        </w:rPr>
+        <w:t xml:space="preserve">]</w:t>
+      </w:r>
+      <w:r>
+        <w:rPr>
+          <w:rFonts w:ascii="Times New Roman" w:hAnsi="Times New Roman"/>
+          <w:sz w:val="24"/>
+          <w:szCs w:val="24"/>
+        </w:rPr>
+        <w:t xml:space="preserve">  </w:t>
+      </w:r>
+      <w:r>
+        <w:rPr>
+          <w:rStyle w:val="DraftingChoice"/>
+          <w:rFonts w:ascii="Times New Roman" w:hAnsi="Times New Roman"/>
+          <w:i/>
+          <w:sz w:val="24"/>
+          <w:szCs w:val="24"/>
+        </w:rPr>
+        <w:t xml:space="preserve">[Multiple managers: </w:t>
+      </w:r>
+      <w:r>
+        <w:rPr>
+          <w:rFonts w:ascii="Times New Roman" w:hAnsi="Times New Roman"/>
+          <w:sz w:val="24"/>
+          <w:szCs w:val="24"/>
+        </w:rPr>
+        <w:t xml:space="preserve">Managers</w:t>
+      </w:r>
+      <w:r>
+        <w:rPr>
+          <w:rStyle w:val="DraftingChoice"/>
+          <w:rFonts w:ascii="Times New Roman" w:hAnsi="Times New Roman"/>
+          <w:i/>
+          <w:sz w:val="24"/>
+          <w:szCs w:val="24"/>
+        </w:rPr>
+        <w:t xml:space="preserve">]</w:t>
+      </w:r>
+      <w:r>
+        <w:rPr>
+          <w:rStyle w:val="DraftingChoice"/>
+          <w:rFonts w:ascii="Times New Roman" w:hAnsi="Times New Roman"/>
+          <w:i/>
+          <w:sz w:val="24"/>
+          <w:szCs w:val="24"/>
+        </w:rPr>
+        <w:t xml:space="preserve">]</w:t>
+      </w:r>
+      <w:r>
+        <w:rPr>
+          <w:rFonts w:ascii="Times New Roman" w:hAnsi="Times New Roman"/>
+          <w:sz w:val="24"/>
+          <w:szCs w:val="24"/>
+        </w:rPr>
+        <w:t xml:space="preserve">.</w:t>
       </w:r>
     </w:p>
     <w:p>
@@ -148,53 +320,305 @@
           <w:sz w:val="24"/>
           <w:szCs w:val="24"/>
         </w:rPr>
-        <w:t xml:space="preserve">A. The Company is governed by the Amended and Restated Operating Agreement of the Company effective as of [AGREEMENT DATE] (the "Agreement").</w:t>
-      </w:r>
-    </w:p>
-    <w:p>
-      <w:pPr>
-        <w:widowControl/>
-        <w:spacing w:after="160"/>
-        <w:jc w:val="both"/>
-      </w:pPr>
-      <w:r>
-        <w:rPr>
-          <w:rFonts w:ascii="Times New Roman" w:hAnsi="Times New Roman"/>
-          <w:sz w:val="24"/>
-          <w:szCs w:val="24"/>
-        </w:rPr>
-        <w:t xml:space="preserve">B. Section [AMENDMENT SECTION] of the Agreement provides that the Agreement may be amended only by a written instrument signed by the Memberall Members.</w:t>
-      </w:r>
-    </w:p>
-    <w:p>
-      <w:pPr>
-        <w:widowControl/>
-        <w:spacing w:after="160"/>
-        <w:jc w:val="both"/>
-      </w:pPr>
-      <w:r>
-        <w:rPr>
-          <w:rFonts w:ascii="Times New Roman" w:hAnsi="Times New Roman"/>
-          <w:sz w:val="24"/>
-          <w:szCs w:val="24"/>
-        </w:rPr>
-        <w:t xml:space="preserve">C. The Member wishesThe Members wish to amend the Agreement as set forth in this Amendment.</w:t>
-      </w:r>
-    </w:p>
-    <w:p>
-      <w:pPr>
-        <w:keepNext/>
-        <w:widowControl/>
-        <w:spacing w:after="160"/>
-        <w:jc w:val="both"/>
-      </w:pPr>
-      <w:r>
-        <w:rPr>
-          <w:rFonts w:ascii="Times New Roman" w:hAnsi="Times New Roman"/>
-          <w:sz w:val="24"/>
-          <w:szCs w:val="24"/>
-        </w:rPr>
-        <w:t xml:space="preserve">NOW, THEREFORE, the Member amendsthe Members amend the Agreement as follows:</w:t>
+        <w:t xml:space="preserve">A. The Company is governed by the  </w:t>
+      </w:r>
+      <w:r>
+        <w:rPr>
+          <w:rStyle w:val="DraftingChoice"/>
+          <w:rFonts w:ascii="Times New Roman" w:hAnsi="Times New Roman"/>
+          <w:i/>
+          <w:sz w:val="24"/>
+          <w:szCs w:val="24"/>
+        </w:rPr>
+        <w:t xml:space="preserve">[If amended and restated agreement: </w:t>
+      </w:r>
+      <w:r>
+        <w:rPr>
+          <w:rFonts w:ascii="Times New Roman" w:hAnsi="Times New Roman"/>
+          <w:sz w:val="24"/>
+          <w:szCs w:val="24"/>
+        </w:rPr>
+        <w:t xml:space="preserve">Amended and Restated</w:t>
+      </w:r>
+      <w:r>
+        <w:rPr>
+          <w:rStyle w:val="DraftingChoice"/>
+          <w:rFonts w:ascii="Times New Roman" w:hAnsi="Times New Roman"/>
+          <w:i/>
+          <w:sz w:val="24"/>
+          <w:szCs w:val="24"/>
+        </w:rPr>
+        <w:t xml:space="preserve">]</w:t>
+      </w:r>
+      <w:r>
+        <w:rPr>
+          <w:rFonts w:ascii="Times New Roman" w:hAnsi="Times New Roman"/>
+          <w:sz w:val="24"/>
+          <w:szCs w:val="24"/>
+        </w:rPr>
+        <w:t xml:space="preserve"> Operating Agreement of the Company effective as of [AGREEMENT DATE] (the "Agreement").</w:t>
+      </w:r>
+    </w:p>
+    <w:p>
+      <w:pPr>
+        <w:widowControl/>
+        <w:spacing w:after="160"/>
+        <w:jc w:val="both"/>
+      </w:pPr>
+      <w:r>
+        <w:rPr>
+          <w:rFonts w:ascii="Times New Roman" w:hAnsi="Times New Roman"/>
+          <w:sz w:val="24"/>
+          <w:szCs w:val="24"/>
+        </w:rPr>
+        <w:t xml:space="preserve">B. Section [AMENDMENT SECTION] of the Agreement provides that the Agreement may be amended only by a written instrument signed by  </w:t>
+      </w:r>
+      <w:r>
+        <w:rPr>
+          <w:rStyle w:val="DraftingChoice"/>
+          <w:rFonts w:ascii="Times New Roman" w:hAnsi="Times New Roman"/>
+          <w:i/>
+          <w:sz w:val="24"/>
+          <w:szCs w:val="24"/>
+        </w:rPr>
+        <w:t xml:space="preserve">[One member: </w:t>
+      </w:r>
+      <w:r>
+        <w:rPr>
+          <w:rFonts w:ascii="Times New Roman" w:hAnsi="Times New Roman"/>
+          <w:sz w:val="24"/>
+          <w:szCs w:val="24"/>
+        </w:rPr>
+        <w:t xml:space="preserve">the Member</w:t>
+      </w:r>
+      <w:r>
+        <w:rPr>
+          <w:rStyle w:val="DraftingChoice"/>
+          <w:rFonts w:ascii="Times New Roman" w:hAnsi="Times New Roman"/>
+          <w:i/>
+          <w:sz w:val="24"/>
+          <w:szCs w:val="24"/>
+        </w:rPr>
+        <w:t xml:space="preserve">]</w:t>
+      </w:r>
+      <w:r>
+        <w:rPr>
+          <w:rFonts w:ascii="Times New Roman" w:hAnsi="Times New Roman"/>
+          <w:sz w:val="24"/>
+          <w:szCs w:val="24"/>
+        </w:rPr>
+        <w:t xml:space="preserve">  </w:t>
+      </w:r>
+      <w:r>
+        <w:rPr>
+          <w:rStyle w:val="DraftingChoice"/>
+          <w:rFonts w:ascii="Times New Roman" w:hAnsi="Times New Roman"/>
+          <w:i/>
+          <w:sz w:val="24"/>
+          <w:szCs w:val="24"/>
+        </w:rPr>
+        <w:t xml:space="preserve">[Multiple members: </w:t>
+      </w:r>
+      <w:r>
+        <w:rPr>
+          <w:rFonts w:ascii="Times New Roman" w:hAnsi="Times New Roman"/>
+          <w:sz w:val="24"/>
+          <w:szCs w:val="24"/>
+        </w:rPr>
+        <w:t xml:space="preserve">all Members</w:t>
+      </w:r>
+      <w:r>
+        <w:rPr>
+          <w:rStyle w:val="DraftingChoice"/>
+          <w:rFonts w:ascii="Times New Roman" w:hAnsi="Times New Roman"/>
+          <w:i/>
+          <w:sz w:val="24"/>
+          <w:szCs w:val="24"/>
+        </w:rPr>
+        <w:t xml:space="preserve">]</w:t>
+      </w:r>
+      <w:r>
+        <w:rPr>
+          <w:rFonts w:ascii="Times New Roman" w:hAnsi="Times New Roman"/>
+          <w:sz w:val="24"/>
+          <w:szCs w:val="24"/>
+        </w:rPr>
+        <w:t xml:space="preserve">.</w:t>
+      </w:r>
+    </w:p>
+    <w:p>
+      <w:pPr>
+        <w:widowControl/>
+        <w:spacing w:after="160"/>
+        <w:jc w:val="both"/>
+      </w:pPr>
+      <w:r>
+        <w:rPr>
+          <w:rFonts w:ascii="Times New Roman" w:hAnsi="Times New Roman"/>
+          <w:sz w:val="24"/>
+          <w:szCs w:val="24"/>
+        </w:rPr>
+        <w:t xml:space="preserve">C.  </w:t>
+      </w:r>
+      <w:r>
+        <w:rPr>
+          <w:rStyle w:val="DraftingChoice"/>
+          <w:rFonts w:ascii="Times New Roman" w:hAnsi="Times New Roman"/>
+          <w:i/>
+          <w:sz w:val="24"/>
+          <w:szCs w:val="24"/>
+        </w:rPr>
+        <w:t xml:space="preserve">[One member: </w:t>
+      </w:r>
+      <w:r>
+        <w:rPr>
+          <w:rFonts w:ascii="Times New Roman" w:hAnsi="Times New Roman"/>
+          <w:sz w:val="24"/>
+          <w:szCs w:val="24"/>
+        </w:rPr>
+        <w:t xml:space="preserve">The Member wishes</w:t>
+      </w:r>
+      <w:r>
+        <w:rPr>
+          <w:rStyle w:val="DraftingChoice"/>
+          <w:rFonts w:ascii="Times New Roman" w:hAnsi="Times New Roman"/>
+          <w:i/>
+          <w:sz w:val="24"/>
+          <w:szCs w:val="24"/>
+        </w:rPr>
+        <w:t xml:space="preserve">]</w:t>
+      </w:r>
+      <w:r>
+        <w:rPr>
+          <w:rFonts w:ascii="Times New Roman" w:hAnsi="Times New Roman"/>
+          <w:sz w:val="24"/>
+          <w:szCs w:val="24"/>
+        </w:rPr>
+        <w:t xml:space="preserve">  </w:t>
+      </w:r>
+      <w:r>
+        <w:rPr>
+          <w:rStyle w:val="DraftingChoice"/>
+          <w:rFonts w:ascii="Times New Roman" w:hAnsi="Times New Roman"/>
+          <w:i/>
+          <w:sz w:val="24"/>
+          <w:szCs w:val="24"/>
+        </w:rPr>
+        <w:t xml:space="preserve">[Multiple members: </w:t>
+      </w:r>
+      <w:r>
+        <w:rPr>
+          <w:rFonts w:ascii="Times New Roman" w:hAnsi="Times New Roman"/>
+          <w:sz w:val="24"/>
+          <w:szCs w:val="24"/>
+        </w:rPr>
+        <w:t xml:space="preserve">The Members wish</w:t>
+      </w:r>
+      <w:r>
+        <w:rPr>
+          <w:rStyle w:val="DraftingChoice"/>
+          <w:rFonts w:ascii="Times New Roman" w:hAnsi="Times New Roman"/>
+          <w:i/>
+          <w:sz w:val="24"/>
+          <w:szCs w:val="24"/>
+        </w:rPr>
+        <w:t xml:space="preserve">]</w:t>
+      </w:r>
+      <w:r>
+        <w:rPr>
+          <w:rFonts w:ascii="Times New Roman" w:hAnsi="Times New Roman"/>
+          <w:sz w:val="24"/>
+          <w:szCs w:val="24"/>
+        </w:rPr>
+        <w:t xml:space="preserve">  to amend the Agreement as set forth in this Amendment.</w:t>
+      </w:r>
+    </w:p>
+    <w:p>
+      <w:pPr>
+        <w:keepNext/>
+        <w:widowControl/>
+        <w:spacing w:after="160"/>
+        <w:jc w:val="both"/>
+      </w:pPr>
+      <w:r>
+        <w:rPr>
+          <w:rFonts w:ascii="Times New Roman" w:hAnsi="Times New Roman"/>
+          <w:sz w:val="24"/>
+          <w:szCs w:val="24"/>
+        </w:rPr>
+        <w:t xml:space="preserve">NOW, THEREFORE,  </w:t>
+      </w:r>
+      <w:r>
+        <w:rPr>
+          <w:rStyle w:val="DraftingChoice"/>
+          <w:rFonts w:ascii="Times New Roman" w:hAnsi="Times New Roman"/>
+          <w:i/>
+          <w:sz w:val="24"/>
+          <w:szCs w:val="24"/>
+        </w:rPr>
+        <w:t xml:space="preserve">[One member: </w:t>
+      </w:r>
+      <w:r>
+        <w:rPr>
+          <w:rFonts w:ascii="Times New Roman" w:hAnsi="Times New Roman"/>
+          <w:sz w:val="24"/>
+          <w:szCs w:val="24"/>
+        </w:rPr>
+        <w:t xml:space="preserve">the Member amends</w:t>
+      </w:r>
+      <w:r>
+        <w:rPr>
+          <w:rStyle w:val="DraftingChoice"/>
+          <w:rFonts w:ascii="Times New Roman" w:hAnsi="Times New Roman"/>
+          <w:i/>
+          <w:sz w:val="24"/>
+          <w:szCs w:val="24"/>
+        </w:rPr>
+        <w:t xml:space="preserve">]</w:t>
+      </w:r>
+      <w:r>
+        <w:rPr>
+          <w:rFonts w:ascii="Times New Roman" w:hAnsi="Times New Roman"/>
+          <w:sz w:val="24"/>
+          <w:szCs w:val="24"/>
+        </w:rPr>
+        <w:t xml:space="preserve">  </w:t>
+      </w:r>
+      <w:r>
+        <w:rPr>
+          <w:rStyle w:val="DraftingChoice"/>
+          <w:rFonts w:ascii="Times New Roman" w:hAnsi="Times New Roman"/>
+          <w:i/>
+          <w:sz w:val="24"/>
+          <w:szCs w:val="24"/>
+        </w:rPr>
+        <w:t xml:space="preserve">[Multiple members: </w:t>
+      </w:r>
+      <w:r>
+        <w:rPr>
+          <w:rFonts w:ascii="Times New Roman" w:hAnsi="Times New Roman"/>
+          <w:sz w:val="24"/>
+          <w:szCs w:val="24"/>
+        </w:rPr>
+        <w:t xml:space="preserve">the Members amend</w:t>
+      </w:r>
+      <w:r>
+        <w:rPr>
+          <w:rStyle w:val="DraftingChoice"/>
+          <w:rFonts w:ascii="Times New Roman" w:hAnsi="Times New Roman"/>
+          <w:i/>
+          <w:sz w:val="24"/>
+          <w:szCs w:val="24"/>
+        </w:rPr>
+        <w:t xml:space="preserve">]</w:t>
+      </w:r>
+      <w:r>
+        <w:rPr>
+          <w:rFonts w:ascii="Times New Roman" w:hAnsi="Times New Roman"/>
+          <w:sz w:val="24"/>
+          <w:szCs w:val="24"/>
+        </w:rPr>
+        <w:t xml:space="preserve">  the Agreement as follows:</w:t>
       </w:r>
     </w:p>
     <w:p>
@@ -246,19 +670,49 @@
       </w:pPr>
       <w:r>
         <w:rPr>
+          <w:rStyle w:val="DraftingChoice"/>
+          <w:rFonts w:ascii="Times New Roman" w:hAnsi="Times New Roman"/>
+          <w:i/>
+          <w:sz w:val="24"/>
+          <w:szCs w:val="24"/>
+        </w:rPr>
+        <w:t xml:space="preserve">[If amendment text entered below: </w:t>
+      </w:r>
+      <w:r>
+        <w:rPr>
           <w:rFonts w:ascii="Times New Roman" w:hAnsi="Times New Roman"/>
           <w:sz w:val="24"/>
           <w:szCs w:val="24"/>
         </w:rPr>
         <w:t xml:space="preserve">[AMENDMENT TEXT]</w:t>
       </w:r>
-    </w:p>
-    <w:p>
-      <w:pPr>
-        <w:widowControl/>
-        <w:spacing w:after="160"/>
-        <w:jc w:val="both"/>
-      </w:pPr>
+      <w:r>
+        <w:rPr>
+          <w:rStyle w:val="DraftingChoice"/>
+          <w:rFonts w:ascii="Times New Roman" w:hAnsi="Times New Roman"/>
+          <w:i/>
+          <w:sz w:val="24"/>
+          <w:szCs w:val="24"/>
+        </w:rPr>
+        <w:t xml:space="preserve">]</w:t>
+      </w:r>
+    </w:p>
+    <w:p>
+      <w:pPr>
+        <w:widowControl/>
+        <w:spacing w:after="160"/>
+        <w:jc w:val="both"/>
+      </w:pPr>
+      <w:r>
+        <w:rPr>
+          <w:rStyle w:val="DraftingChoice"/>
+          <w:rFonts w:ascii="Times New Roman" w:hAnsi="Times New Roman"/>
+          <w:i/>
+          <w:sz w:val="24"/>
+          <w:szCs w:val="24"/>
+        </w:rPr>
+        <w:t xml:space="preserve">[If amendment attached as exhibit a: </w:t>
+      </w:r>
       <w:r>
         <w:rPr>
           <w:rFonts w:ascii="Times New Roman" w:hAnsi="Times New Roman"/>
@@ -266,6 +720,16 @@
           <w:szCs w:val="24"/>
         </w:rPr>
         <w:t xml:space="preserve">The Agreement is amended as set forth in Exhibit A attached to this Amendment.</w:t>
+      </w:r>
+      <w:r>
+        <w:rPr>
+          <w:rStyle w:val="DraftingChoice"/>
+          <w:rFonts w:ascii="Times New Roman" w:hAnsi="Times New Roman"/>
+          <w:i/>
+          <w:sz w:val="24"/>
+          <w:szCs w:val="24"/>
+        </w:rPr>
+        <w:t xml:space="preserve">]</w:t>
       </w:r>
     </w:p>
     <w:p>
@@ -321,16 +785,97 @@
           <w:sz w:val="24"/>
           <w:szCs w:val="24"/>
         </w:rPr>
-        <w:t xml:space="preserve">IN WITNESS WHEREOF, the undersigned hashave executed this Amendment as of the date stated above.</w:t>
-      </w:r>
-    </w:p>
-    <w:p>
-      <w:pPr>
-        <w:keepNext/>
-        <w:widowControl/>
-        <w:spacing w:after="160"/>
-        <w:jc w:val="both"/>
-      </w:pPr>
+        <w:t xml:space="preserve">IN WITNESS WHEREOF, the undersigned  </w:t>
+      </w:r>
+      <w:r>
+        <w:rPr>
+          <w:rStyle w:val="DraftingChoice"/>
+          <w:rFonts w:ascii="Times New Roman" w:hAnsi="Times New Roman"/>
+          <w:i/>
+          <w:sz w:val="24"/>
+          <w:szCs w:val="24"/>
+        </w:rPr>
+        <w:t xml:space="preserve">[One member: </w:t>
+      </w:r>
+      <w:r>
+        <w:rPr>
+          <w:rFonts w:ascii="Times New Roman" w:hAnsi="Times New Roman"/>
+          <w:sz w:val="24"/>
+          <w:szCs w:val="24"/>
+        </w:rPr>
+        <w:t xml:space="preserve">has</w:t>
+      </w:r>
+      <w:r>
+        <w:rPr>
+          <w:rStyle w:val="DraftingChoice"/>
+          <w:rFonts w:ascii="Times New Roman" w:hAnsi="Times New Roman"/>
+          <w:i/>
+          <w:sz w:val="24"/>
+          <w:szCs w:val="24"/>
+        </w:rPr>
+        <w:t xml:space="preserve">]</w:t>
+      </w:r>
+      <w:r>
+        <w:rPr>
+          <w:rFonts w:ascii="Times New Roman" w:hAnsi="Times New Roman"/>
+          <w:sz w:val="24"/>
+          <w:szCs w:val="24"/>
+        </w:rPr>
+        <w:t xml:space="preserve">  </w:t>
+      </w:r>
+      <w:r>
+        <w:rPr>
+          <w:rStyle w:val="DraftingChoice"/>
+          <w:rFonts w:ascii="Times New Roman" w:hAnsi="Times New Roman"/>
+          <w:i/>
+          <w:sz w:val="24"/>
+          <w:szCs w:val="24"/>
+        </w:rPr>
+        <w:t xml:space="preserve">[Multiple members: </w:t>
+      </w:r>
+      <w:r>
+        <w:rPr>
+          <w:rFonts w:ascii="Times New Roman" w:hAnsi="Times New Roman"/>
+          <w:sz w:val="24"/>
+          <w:szCs w:val="24"/>
+        </w:rPr>
+        <w:t xml:space="preserve">have</w:t>
+      </w:r>
+      <w:r>
+        <w:rPr>
+          <w:rStyle w:val="DraftingChoice"/>
+          <w:rFonts w:ascii="Times New Roman" w:hAnsi="Times New Roman"/>
+          <w:i/>
+          <w:sz w:val="24"/>
+          <w:szCs w:val="24"/>
+        </w:rPr>
+        <w:t xml:space="preserve">]</w:t>
+      </w:r>
+      <w:r>
+        <w:rPr>
+          <w:rFonts w:ascii="Times New Roman" w:hAnsi="Times New Roman"/>
+          <w:sz w:val="24"/>
+          <w:szCs w:val="24"/>
+        </w:rPr>
+        <w:t xml:space="preserve">  executed this Amendment as of the date stated above.</w:t>
+      </w:r>
+    </w:p>
+    <w:p>
+      <w:pPr>
+        <w:widowControl/>
+        <w:spacing w:after="160"/>
+        <w:jc w:val="both"/>
+      </w:pPr>
+      <w:r>
+        <w:rPr>
+          <w:rStyle w:val="DraftingChoice"/>
+          <w:rFonts w:ascii="Times New Roman" w:hAnsi="Times New Roman"/>
+          <w:i/>
+          <w:sz w:val="24"/>
+          <w:szCs w:val="24"/>
+        </w:rPr>
+        <w:t xml:space="preserve">[One member: </w:t>
+      </w:r>
       <w:r>
         <w:rPr>
           <w:rFonts w:ascii="Times New Roman" w:hAnsi="Times New Roman"/>
@@ -342,6 +887,34 @@
       </w:r>
       <w:r>
         <w:rPr>
+          <w:rStyle w:val="DraftingChoice"/>
+          <w:rFonts w:ascii="Times New Roman" w:hAnsi="Times New Roman"/>
+          <w:i/>
+          <w:sz w:val="24"/>
+          <w:szCs w:val="24"/>
+        </w:rPr>
+        <w:t xml:space="preserve">]</w:t>
+      </w:r>
+      <w:r>
+        <w:rPr>
+          <w:rFonts w:ascii="Times New Roman" w:hAnsi="Times New Roman"/>
+          <w:sz w:val="24"/>
+          <w:szCs w:val="24"/>
+        </w:rPr>
+        <w:t xml:space="preserve">  </w:t>
+      </w:r>
+      <w:r>
+        <w:rPr>
+          <w:rStyle w:val="DraftingChoice"/>
+          <w:rFonts w:ascii="Times New Roman" w:hAnsi="Times New Roman"/>
+          <w:i/>
+          <w:sz w:val="24"/>
+          <w:szCs w:val="24"/>
+        </w:rPr>
+        <w:t xml:space="preserve">[Multiple members: </w:t>
+      </w:r>
+      <w:r>
+        <w:rPr>
           <w:rFonts w:ascii="Times New Roman" w:hAnsi="Times New Roman"/>
           <w:b/>
           <w:sz w:val="24"/>
@@ -349,6 +922,34 @@
         </w:rPr>
         <w:t xml:space="preserve">MEMBERS:</w:t>
       </w:r>
+      <w:r>
+        <w:rPr>
+          <w:rStyle w:val="DraftingChoice"/>
+          <w:rFonts w:ascii="Times New Roman" w:hAnsi="Times New Roman"/>
+          <w:i/>
+          <w:sz w:val="24"/>
+          <w:szCs w:val="24"/>
+        </w:rPr>
+        <w:t xml:space="preserve">]</w:t>
+      </w:r>
+    </w:p>
+    <w:p>
+      <w:pPr>
+        <w:keepNext/>
+        <w:widowControl/>
+        <w:spacing w:after="80"/>
+        <w:jc w:val="both"/>
+      </w:pPr>
+      <w:r>
+        <w:rPr>
+          <w:rStyle w:val="DraftingChoice"/>
+          <w:rFonts w:ascii="Times New Roman" w:hAnsi="Times New Roman"/>
+          <w:i/>
+          <w:sz w:val="24"/>
+          <w:szCs w:val="24"/>
+        </w:rPr>
+        <w:t xml:space="preserve">[If joint ownership unit:]</w:t>
+      </w:r>
     </w:p>
     <w:p>
       <w:pPr>
@@ -385,6 +986,41 @@
     <w:p>
       <w:pPr>
         <w:widowControl/>
+        <w:spacing w:after="80"/>
+        <w:jc w:val="both"/>
+      </w:pPr>
+      <w:r>
+        <w:rPr>
+          <w:rStyle w:val="DraftingChoice"/>
+          <w:rFonts w:ascii="Times New Roman" w:hAnsi="Times New Roman"/>
+          <w:i/>
+          <w:sz w:val="24"/>
+          <w:szCs w:val="24"/>
+        </w:rPr>
+        <w:t xml:space="preserve">[End if joint ownership unit.]</w:t>
+      </w:r>
+    </w:p>
+    <w:p>
+      <w:pPr>
+        <w:keepNext/>
+        <w:widowControl/>
+        <w:spacing w:after="80"/>
+        <w:jc w:val="both"/>
+      </w:pPr>
+      <w:r>
+        <w:rPr>
+          <w:rStyle w:val="DraftingChoice"/>
+          <w:rFonts w:ascii="Times New Roman" w:hAnsi="Times New Roman"/>
+          <w:i/>
+          <w:sz w:val="24"/>
+          <w:szCs w:val="24"/>
+        </w:rPr>
+        <w:t xml:space="preserve">[If individual signer:]</w:t>
+      </w:r>
+    </w:p>
+    <w:p>
+      <w:pPr>
+        <w:widowControl/>
         <w:spacing w:after="160"/>
         <w:jc w:val="both"/>
       </w:pPr>
@@ -431,6 +1067,41 @@
     <w:p>
       <w:pPr>
         <w:widowControl/>
+        <w:spacing w:after="80"/>
+        <w:jc w:val="both"/>
+      </w:pPr>
+      <w:r>
+        <w:rPr>
+          <w:rStyle w:val="DraftingChoice"/>
+          <w:rFonts w:ascii="Times New Roman" w:hAnsi="Times New Roman"/>
+          <w:i/>
+          <w:sz w:val="24"/>
+          <w:szCs w:val="24"/>
+        </w:rPr>
+        <w:t xml:space="preserve">[End if individual signer.]</w:t>
+      </w:r>
+    </w:p>
+    <w:p>
+      <w:pPr>
+        <w:keepNext/>
+        <w:widowControl/>
+        <w:spacing w:after="80"/>
+        <w:jc w:val="both"/>
+      </w:pPr>
+      <w:r>
+        <w:rPr>
+          <w:rStyle w:val="DraftingChoice"/>
+          <w:rFonts w:ascii="Times New Roman" w:hAnsi="Times New Roman"/>
+          <w:i/>
+          <w:sz w:val="24"/>
+          <w:szCs w:val="24"/>
+        </w:rPr>
+        <w:t xml:space="preserve">[If entity signer:]</w:t>
+      </w:r>
+    </w:p>
+    <w:p>
+      <w:pPr>
+        <w:widowControl/>
         <w:spacing w:after="160"/>
         <w:jc w:val="both"/>
       </w:pPr>
@@ -509,11 +1180,56 @@
     </w:p>
     <w:p>
       <w:pPr>
-        <w:keepNext/>
-        <w:widowControl/>
-        <w:spacing w:after="160"/>
-        <w:jc w:val="both"/>
-      </w:pPr>
+        <w:widowControl/>
+        <w:spacing w:after="80"/>
+        <w:jc w:val="both"/>
+      </w:pPr>
+      <w:r>
+        <w:rPr>
+          <w:rStyle w:val="DraftingChoice"/>
+          <w:rFonts w:ascii="Times New Roman" w:hAnsi="Times New Roman"/>
+          <w:i/>
+          <w:sz w:val="24"/>
+          <w:szCs w:val="24"/>
+        </w:rPr>
+        <w:t xml:space="preserve">[End if entity signer.]</w:t>
+      </w:r>
+    </w:p>
+    <w:p>
+      <w:pPr>
+        <w:keepNext/>
+        <w:widowControl/>
+        <w:spacing w:after="80"/>
+        <w:jc w:val="both"/>
+      </w:pPr>
+      <w:r>
+        <w:rPr>
+          <w:rStyle w:val="DraftingChoice"/>
+          <w:rFonts w:ascii="Times New Roman" w:hAnsi="Times New Roman"/>
+          <w:i/>
+          <w:sz w:val="24"/>
+          <w:szCs w:val="24"/>
+        </w:rPr>
+        <w:t xml:space="preserve">[If manager-managed company:]</w:t>
+      </w:r>
+    </w:p>
+    <w:p>
+      <w:pPr>
+        <w:keepNext/>
+        <w:widowControl/>
+        <w:spacing w:after="80"/>
+        <w:jc w:val="both"/>
+      </w:pPr>
+      <w:r>
+        <w:rPr>
+          <w:rStyle w:val="DraftingChoice"/>
+          <w:rFonts w:ascii="Times New Roman" w:hAnsi="Times New Roman"/>
+          <w:i/>
+          <w:sz w:val="24"/>
+          <w:szCs w:val="24"/>
+        </w:rPr>
+        <w:t xml:space="preserve">[One manager: </w:t>
+      </w:r>
       <w:r>
         <w:rPr>
           <w:rFonts w:ascii="Times New Roman" w:hAnsi="Times New Roman"/>
@@ -525,6 +1241,34 @@
       </w:r>
       <w:r>
         <w:rPr>
+          <w:rStyle w:val="DraftingChoice"/>
+          <w:rFonts w:ascii="Times New Roman" w:hAnsi="Times New Roman"/>
+          <w:i/>
+          <w:sz w:val="24"/>
+          <w:szCs w:val="24"/>
+        </w:rPr>
+        <w:t xml:space="preserve">]</w:t>
+      </w:r>
+      <w:r>
+        <w:rPr>
+          <w:rFonts w:ascii="Times New Roman" w:hAnsi="Times New Roman"/>
+          <w:sz w:val="24"/>
+          <w:szCs w:val="24"/>
+        </w:rPr>
+        <w:t xml:space="preserve">  </w:t>
+      </w:r>
+      <w:r>
+        <w:rPr>
+          <w:rStyle w:val="DraftingChoice"/>
+          <w:rFonts w:ascii="Times New Roman" w:hAnsi="Times New Roman"/>
+          <w:i/>
+          <w:sz w:val="24"/>
+          <w:szCs w:val="24"/>
+        </w:rPr>
+        <w:t xml:space="preserve">[Multiple managers: </w:t>
+      </w:r>
+      <w:r>
+        <w:rPr>
           <w:rFonts w:ascii="Times New Roman" w:hAnsi="Times New Roman"/>
           <w:b/>
           <w:sz w:val="24"/>
@@ -532,6 +1276,34 @@
         </w:rPr>
         <w:t xml:space="preserve">ACKNOWLEDGED AND AGREED BY MANAGERS:</w:t>
       </w:r>
+      <w:r>
+        <w:rPr>
+          <w:rStyle w:val="DraftingChoice"/>
+          <w:rFonts w:ascii="Times New Roman" w:hAnsi="Times New Roman"/>
+          <w:i/>
+          <w:sz w:val="24"/>
+          <w:szCs w:val="24"/>
+        </w:rPr>
+        <w:t xml:space="preserve">]</w:t>
+      </w:r>
+    </w:p>
+    <w:p>
+      <w:pPr>
+        <w:keepNext/>
+        <w:widowControl/>
+        <w:spacing w:after="80"/>
+        <w:jc w:val="both"/>
+      </w:pPr>
+      <w:r>
+        <w:rPr>
+          <w:rStyle w:val="DraftingChoice"/>
+          <w:rFonts w:ascii="Times New Roman" w:hAnsi="Times New Roman"/>
+          <w:i/>
+          <w:sz w:val="24"/>
+          <w:szCs w:val="24"/>
+        </w:rPr>
+        <w:t xml:space="preserve">[If individual signer:]</w:t>
+      </w:r>
     </w:p>
     <w:p>
       <w:pPr>
@@ -582,6 +1354,41 @@
     <w:p>
       <w:pPr>
         <w:widowControl/>
+        <w:spacing w:after="80"/>
+        <w:jc w:val="both"/>
+      </w:pPr>
+      <w:r>
+        <w:rPr>
+          <w:rStyle w:val="DraftingChoice"/>
+          <w:rFonts w:ascii="Times New Roman" w:hAnsi="Times New Roman"/>
+          <w:i/>
+          <w:sz w:val="24"/>
+          <w:szCs w:val="24"/>
+        </w:rPr>
+        <w:t xml:space="preserve">[End if individual signer.]</w:t>
+      </w:r>
+    </w:p>
+    <w:p>
+      <w:pPr>
+        <w:keepNext/>
+        <w:widowControl/>
+        <w:spacing w:after="80"/>
+        <w:jc w:val="both"/>
+      </w:pPr>
+      <w:r>
+        <w:rPr>
+          <w:rStyle w:val="DraftingChoice"/>
+          <w:rFonts w:ascii="Times New Roman" w:hAnsi="Times New Roman"/>
+          <w:i/>
+          <w:sz w:val="24"/>
+          <w:szCs w:val="24"/>
+        </w:rPr>
+        <w:t xml:space="preserve">[If entity signer:]</w:t>
+      </w:r>
+    </w:p>
+    <w:p>
+      <w:pPr>
+        <w:widowControl/>
         <w:spacing w:after="160"/>
         <w:jc w:val="both"/>
       </w:pPr>
@@ -656,6 +1463,40 @@
           <w:szCs w:val="24"/>
         </w:rPr>
         <w:t xml:space="preserve">Date: _____________________________</w:t>
+      </w:r>
+    </w:p>
+    <w:p>
+      <w:pPr>
+        <w:widowControl/>
+        <w:spacing w:after="80"/>
+        <w:jc w:val="both"/>
+      </w:pPr>
+      <w:r>
+        <w:rPr>
+          <w:rStyle w:val="DraftingChoice"/>
+          <w:rFonts w:ascii="Times New Roman" w:hAnsi="Times New Roman"/>
+          <w:i/>
+          <w:sz w:val="24"/>
+          <w:szCs w:val="24"/>
+        </w:rPr>
+        <w:t xml:space="preserve">[End if entity signer.]</w:t>
+      </w:r>
+    </w:p>
+    <w:p>
+      <w:pPr>
+        <w:widowControl/>
+        <w:spacing w:after="80"/>
+        <w:jc w:val="both"/>
+      </w:pPr>
+      <w:r>
+        <w:rPr>
+          <w:rStyle w:val="DraftingChoice"/>
+          <w:rFonts w:ascii="Times New Roman" w:hAnsi="Times New Roman"/>
+          <w:i/>
+          <w:sz w:val="24"/>
+          <w:szCs w:val="24"/>
+        </w:rPr>
+        <w:t xml:space="preserve">[End if manager-managed company.]</w:t>
       </w:r>
     </w:p>
     <w:p>

</xml_diff>

<commit_message>
Keep each editable Word signature alternative together
</commit_message>
<xml_diff>
--- a/docs/word/FPSLLC Amendment to Operating Agreement - FORM.docx
+++ b/docs/word/FPSLLC Amendment to Operating Agreement - FORM.docx
@@ -1021,6 +1021,7 @@
     </w:p>
     <w:p>
       <w:pPr>
+        <w:keepNext/>
         <w:widowControl/>
         <w:spacing w:after="160"/>
         <w:jc w:val="both"/>
@@ -1036,6 +1037,7 @@
     </w:p>
     <w:p>
       <w:pPr>
+        <w:keepNext/>
         <w:widowControl/>
         <w:spacing w:after="160"/>
         <w:jc w:val="both"/>
@@ -1102,6 +1104,7 @@
     </w:p>
     <w:p>
       <w:pPr>
+        <w:keepNext/>
         <w:widowControl/>
         <w:spacing w:after="160"/>
         <w:jc w:val="both"/>
@@ -1133,6 +1136,7 @@
     </w:p>
     <w:p>
       <w:pPr>
+        <w:keepNext/>
         <w:keepLines/>
         <w:widowControl/>
         <w:spacing w:after="160"/>
@@ -1149,6 +1153,7 @@
     </w:p>
     <w:p>
       <w:pPr>
+        <w:keepNext/>
         <w:keepLines/>
         <w:widowControl/>
         <w:spacing w:after="160"/>
@@ -1308,6 +1313,7 @@
     </w:p>
     <w:p>
       <w:pPr>
+        <w:keepNext/>
         <w:widowControl/>
         <w:spacing w:after="160"/>
         <w:jc w:val="both"/>
@@ -1323,6 +1329,7 @@
     </w:p>
     <w:p>
       <w:pPr>
+        <w:keepNext/>
         <w:widowControl/>
         <w:spacing w:after="160"/>
         <w:jc w:val="both"/>
@@ -1389,6 +1396,7 @@
     </w:p>
     <w:p>
       <w:pPr>
+        <w:keepNext/>
         <w:widowControl/>
         <w:spacing w:after="160"/>
         <w:jc w:val="both"/>
@@ -1420,6 +1428,7 @@
     </w:p>
     <w:p>
       <w:pPr>
+        <w:keepNext/>
         <w:keepLines/>
         <w:widowControl/>
         <w:spacing w:after="160"/>
@@ -1436,6 +1445,7 @@
     </w:p>
     <w:p>
       <w:pPr>
+        <w:keepNext/>
         <w:keepLines/>
         <w:widowControl/>
         <w:spacing w:after="160"/>

</xml_diff>

<commit_message>
Implement Batch 37 approved release-review corrections
</commit_message>
<xml_diff>
--- a/docs/word/FPSLLC Amendment to Operating Agreement - FORM.docx
+++ b/docs/word/FPSLLC Amendment to Operating Agreement - FORM.docx
@@ -116,7 +116,7 @@
           <w:sz w:val="24"/>
           <w:szCs w:val="24"/>
         </w:rPr>
-        <w:t xml:space="preserve">, a Florida protected series limited liability company (the "Company"), is made effective as of [AMENDMENT DATE], by  </w:t>
+        <w:t xml:space="preserve">, a Florida protected series limited liability company (the "Company"), is made effective as of [AMENDMENT DATE], by </w:t>
       </w:r>
       <w:r>
         <w:rPr>
@@ -152,7 +152,7 @@
           <w:sz w:val="24"/>
           <w:szCs w:val="24"/>
         </w:rPr>
-        <w:t xml:space="preserve">  </w:t>
+        <w:t xml:space="preserve"> </w:t>
       </w:r>
       <w:r>
         <w:rPr>
@@ -188,25 +188,25 @@
           <w:sz w:val="24"/>
           <w:szCs w:val="24"/>
         </w:rPr>
-        <w:t xml:space="preserve">  </w:t>
-      </w:r>
-      <w:r>
-        <w:rPr>
-          <w:rStyle w:val="DraftingChoice"/>
-          <w:rFonts w:ascii="Times New Roman" w:hAnsi="Times New Roman"/>
-          <w:i/>
-          <w:sz w:val="24"/>
-          <w:szCs w:val="24"/>
-        </w:rPr>
-        <w:t xml:space="preserve">[If manager-managed company: </w:t>
-      </w:r>
-      <w:r>
-        <w:rPr>
-          <w:rFonts w:ascii="Times New Roman" w:hAnsi="Times New Roman"/>
-          <w:sz w:val="24"/>
-          <w:szCs w:val="24"/>
-        </w:rPr>
-        <w:t xml:space="preserve">, and is acknowledged by the undersigned  </w:t>
+        <w:t xml:space="preserve"> </w:t>
+      </w:r>
+      <w:r>
+        <w:rPr>
+          <w:rStyle w:val="DraftingChoice"/>
+          <w:rFonts w:ascii="Times New Roman" w:hAnsi="Times New Roman"/>
+          <w:i/>
+          <w:sz w:val="24"/>
+          <w:szCs w:val="24"/>
+        </w:rPr>
+        <w:t xml:space="preserve">[If manager-managed company:</w:t>
+      </w:r>
+      <w:r>
+        <w:rPr>
+          <w:rFonts w:ascii="Times New Roman" w:hAnsi="Times New Roman"/>
+          <w:sz w:val="24"/>
+          <w:szCs w:val="24"/>
+        </w:rPr>
+        <w:t xml:space="preserve">, and is acknowledged by the undersigned </w:t>
       </w:r>
       <w:r>
         <w:rPr>
@@ -242,7 +242,7 @@
           <w:sz w:val="24"/>
           <w:szCs w:val="24"/>
         </w:rPr>
-        <w:t xml:space="preserve">  </w:t>
+        <w:t xml:space="preserve"> </w:t>
       </w:r>
       <w:r>
         <w:rPr>
@@ -320,7 +320,7 @@
           <w:sz w:val="24"/>
           <w:szCs w:val="24"/>
         </w:rPr>
-        <w:t xml:space="preserve">A. The Company is governed by the  </w:t>
+        <w:t xml:space="preserve">A. The Company is governed by the </w:t>
       </w:r>
       <w:r>
         <w:rPr>
@@ -371,7 +371,7 @@
           <w:sz w:val="24"/>
           <w:szCs w:val="24"/>
         </w:rPr>
-        <w:t xml:space="preserve">B. Section [AMENDMENT SECTION] of the Agreement provides that the Agreement may be amended only by a written instrument signed by  </w:t>
+        <w:t xml:space="preserve">B. Section [AMENDMENT SECTION] of the Agreement provides that the Agreement may be amended only by a written instrument signed by </w:t>
       </w:r>
       <w:r>
         <w:rPr>
@@ -407,7 +407,7 @@
           <w:sz w:val="24"/>
           <w:szCs w:val="24"/>
         </w:rPr>
-        <w:t xml:space="preserve">  </w:t>
+        <w:t xml:space="preserve"> </w:t>
       </w:r>
       <w:r>
         <w:rPr>
@@ -458,7 +458,7 @@
           <w:sz w:val="24"/>
           <w:szCs w:val="24"/>
         </w:rPr>
-        <w:t xml:space="preserve">C.  </w:t>
+        <w:t xml:space="preserve">C. </w:t>
       </w:r>
       <w:r>
         <w:rPr>
@@ -494,7 +494,7 @@
           <w:sz w:val="24"/>
           <w:szCs w:val="24"/>
         </w:rPr>
-        <w:t xml:space="preserve">  </w:t>
+        <w:t xml:space="preserve"> </w:t>
       </w:r>
       <w:r>
         <w:rPr>
@@ -530,23 +530,23 @@
           <w:sz w:val="24"/>
           <w:szCs w:val="24"/>
         </w:rPr>
-        <w:t xml:space="preserve">  to amend the Agreement as set forth in this Amendment.</w:t>
-      </w:r>
-    </w:p>
-    <w:p>
-      <w:pPr>
-        <w:keepNext/>
-        <w:widowControl/>
-        <w:spacing w:after="160"/>
-        <w:jc w:val="both"/>
-      </w:pPr>
-      <w:r>
-        <w:rPr>
-          <w:rFonts w:ascii="Times New Roman" w:hAnsi="Times New Roman"/>
-          <w:sz w:val="24"/>
-          <w:szCs w:val="24"/>
-        </w:rPr>
-        <w:t xml:space="preserve">NOW, THEREFORE,  </w:t>
+        <w:t xml:space="preserve"> to amend the Agreement as set forth in this Amendment.</w:t>
+      </w:r>
+    </w:p>
+    <w:p>
+      <w:pPr>
+        <w:keepNext/>
+        <w:widowControl/>
+        <w:spacing w:after="160"/>
+        <w:jc w:val="both"/>
+      </w:pPr>
+      <w:r>
+        <w:rPr>
+          <w:rFonts w:ascii="Times New Roman" w:hAnsi="Times New Roman"/>
+          <w:sz w:val="24"/>
+          <w:szCs w:val="24"/>
+        </w:rPr>
+        <w:t xml:space="preserve">NOW, THEREFORE, </w:t>
       </w:r>
       <w:r>
         <w:rPr>
@@ -582,7 +582,7 @@
           <w:sz w:val="24"/>
           <w:szCs w:val="24"/>
         </w:rPr>
-        <w:t xml:space="preserve">  </w:t>
+        <w:t xml:space="preserve"> </w:t>
       </w:r>
       <w:r>
         <w:rPr>
@@ -618,7 +618,7 @@
           <w:sz w:val="24"/>
           <w:szCs w:val="24"/>
         </w:rPr>
-        <w:t xml:space="preserve">  the Agreement as follows:</w:t>
+        <w:t xml:space="preserve"> the Agreement as follows:</w:t>
       </w:r>
     </w:p>
     <w:p>
@@ -664,8 +664,9 @@
     </w:p>
     <w:p>
       <w:pPr>
-        <w:widowControl/>
-        <w:spacing w:after="160"/>
+        <w:keepNext/>
+        <w:widowControl/>
+        <w:spacing w:after="80"/>
         <w:jc w:val="both"/>
       </w:pPr>
       <w:r>
@@ -699,19 +700,20 @@
     </w:p>
     <w:p>
       <w:pPr>
-        <w:widowControl/>
-        <w:spacing w:after="160"/>
-        <w:jc w:val="both"/>
-      </w:pPr>
-      <w:r>
-        <w:rPr>
-          <w:rStyle w:val="DraftingChoice"/>
-          <w:rFonts w:ascii="Times New Roman" w:hAnsi="Times New Roman"/>
-          <w:i/>
-          <w:sz w:val="24"/>
-          <w:szCs w:val="24"/>
-        </w:rPr>
-        <w:t xml:space="preserve">[If amendment attached as exhibit a: </w:t>
+        <w:keepNext/>
+        <w:widowControl/>
+        <w:spacing w:after="80"/>
+        <w:jc w:val="both"/>
+      </w:pPr>
+      <w:r>
+        <w:rPr>
+          <w:rStyle w:val="DraftingChoice"/>
+          <w:rFonts w:ascii="Times New Roman" w:hAnsi="Times New Roman"/>
+          <w:i/>
+          <w:sz w:val="24"/>
+          <w:szCs w:val="24"/>
+        </w:rPr>
+        <w:t xml:space="preserve">[If amendment attached as Exhibit A: </w:t>
       </w:r>
       <w:r>
         <w:rPr>
@@ -785,7 +787,7 @@
           <w:sz w:val="24"/>
           <w:szCs w:val="24"/>
         </w:rPr>
-        <w:t xml:space="preserve">IN WITNESS WHEREOF, the undersigned  </w:t>
+        <w:t xml:space="preserve">IN WITNESS WHEREOF, the undersigned </w:t>
       </w:r>
       <w:r>
         <w:rPr>
@@ -821,7 +823,7 @@
           <w:sz w:val="24"/>
           <w:szCs w:val="24"/>
         </w:rPr>
-        <w:t xml:space="preserve">  </w:t>
+        <w:t xml:space="preserve"> </w:t>
       </w:r>
       <w:r>
         <w:rPr>
@@ -857,13 +859,14 @@
           <w:sz w:val="24"/>
           <w:szCs w:val="24"/>
         </w:rPr>
-        <w:t xml:space="preserve">  executed this Amendment as of the date stated above.</w:t>
-      </w:r>
-    </w:p>
-    <w:p>
-      <w:pPr>
-        <w:widowControl/>
-        <w:spacing w:after="160"/>
+        <w:t xml:space="preserve"> executed this Amendment as of the date stated above.</w:t>
+      </w:r>
+    </w:p>
+    <w:p>
+      <w:pPr>
+        <w:keepNext/>
+        <w:widowControl/>
+        <w:spacing w:after="80"/>
         <w:jc w:val="both"/>
       </w:pPr>
       <w:r>
@@ -901,7 +904,7 @@
           <w:sz w:val="24"/>
           <w:szCs w:val="24"/>
         </w:rPr>
-        <w:t xml:space="preserve">  </w:t>
+        <w:t xml:space="preserve"> </w:t>
       </w:r>
       <w:r>
         <w:rPr>
@@ -1261,7 +1264,7 @@
           <w:sz w:val="24"/>
           <w:szCs w:val="24"/>
         </w:rPr>
-        <w:t xml:space="preserve">  </w:t>
+        <w:t xml:space="preserve"> </w:t>
       </w:r>
       <w:r>
         <w:rPr>
@@ -1578,6 +1581,12 @@
   </w:docDefaults>
   <w:style w:type="paragraph" w:default="1" w:styleId="Normal">
     <w:name w:val="Normal"/>
+  </w:style>
+  <w:style w:type="character" w:styleId="DraftingChoice">
+    <w:name w:val="Drafting Choice"/>
+    <w:rPr>
+      <w:i/>
+    </w:rPr>
   </w:style>
   <w:style w:type="paragraph" w:styleId="Heading1">
     <w:name w:val="heading 1"/>

</xml_diff>